<commit_message>
actualice tabla de kityy, positron y agregué caso a stow
</commit_message>
<xml_diff>
--- a/_site/operating-system/2025-12-31-guia-de-kitty-terminal/index.docx
+++ b/_site/operating-system/2025-12-31-guia-de-kitty-terminal/index.docx
@@ -202,7 +202,7 @@
         <w:pStyle w:val="AbstractFirstParagraph"/>
       </w:pPr>
       <w:r>
-        <w:t xml:space="preserve">Ranger es un gestor de archivos basado en consola altamente eficiente, diseñado con una fuerte inspiración en los atajos de teclado de Vim y una filosofía minimalista. Esta guía completa explora en detalle su instalación en diferentes sistemas operativos, configuración inicial y avanzada, estructura de archivos de configuración (rc.conf, rifle.conf, scope.sh, commands.py), así como la personalización profunda mediante mapeos de teclado, comandos personalizados en Python y plugins. Se detallan las características principales que lo distinguen; navegación multi-columna, previsualización automática de múltiples tipos de archivo (texto, código, imágenes, PDFs, videos, comprimidos), gestión inteligente de archivos mediante rifle, soporte de pestañas, marcadores, renombrado masivo, integración con el shell y capacidades de preview mejoradas mediante herramientas externas. La guía incluye referencias prácticas de atajos fundamentales y avanzados, ejemplos de configuración realistas, soluciones a problemas comunes, trucos de productividad y recomendaciones para integrar Ranger en flujos de trabajo diarios de usuarios de terminal (especialmente aquellos familiarizados con Vim/Neovim). Dirigida tanto a usuarios noveles que buscan reemplazar gestores gráficos tradicionales, como a usuarios avanzados que desean optimizar y extender al máximo esta poderosa herramienta de gestión de archivos en entornos Linux.</w:t>
+        <w:t xml:space="preserve">Kitty es un emulador de terminal moderno, rápido y altamente personalizable que aprovecha la aceleración por GPU para ofrecer un rendimiento excepcional. Esta guía completa aborda desde la instalación en diferentes sistemas operativos hasta la configuración avanzada y optimización profunda de Kitty. Se exploran en detalle; arquitectura y principios de diseño, jerarquía de ventanas/pestañas, configuración de kitty.conf, manejo de fuentes con ligaduras, gestión avanzada de colores y temas, layouts nativos (tall, fat, grid, splits, stack), kittens (extensiones), control remoto, integración con shell, marcas, sesiones, optimización de rendimiento y solución de problemas frecuentes. Dirigida tanto a usuarios que buscan reemplazar terminales tradicionales por una opción más veloz y moderna, como a usuarios avanzados que desean exprimir al máximo las capacidades de personalización y automatización que ofrece Kitty en entornos de desarrollo y administración de sistemas.</w:t>
       </w:r>
     </w:p>
     <w:p>
@@ -217,7 +217,7 @@
         <w:t xml:space="preserve">Palabras clave</w:t>
       </w:r>
       <w:r>
-        <w:t xml:space="preserve">: Vim, Ranger, File Manager</w:t>
+        <w:t xml:space="preserve">: Kitty Terminal, Linux, Linea de comandos</w:t>
       </w:r>
     </w:p>
     <w:p>
@@ -465,15 +465,16 @@
     <w:tbl>
       <w:tblPr>
         <w:tblStyle w:val="Table"/>
-        <w:tblW w:type="auto" w:w="0"/>
+        <w:tblW w:type="pct" w:w="5000"/>
+        <w:tblLayout w:type="fixed"/>
         <w:tblLook w:firstRow="1" w:lastRow="0" w:firstColumn="0" w:lastColumn="0" w:noHBand="0" w:noVBand="0" w:val="0020"/>
       </w:tblPr>
       <w:tblGrid>
-        <w:gridCol w:w="1584"/>
-        <w:gridCol w:w="1584"/>
-        <w:gridCol w:w="1584"/>
-        <w:gridCol w:w="1584"/>
-        <w:gridCol w:w="1584"/>
+        <w:gridCol w:w="2224"/>
+        <w:gridCol w:w="1423"/>
+        <w:gridCol w:w="1423"/>
+        <w:gridCol w:w="1423"/>
+        <w:gridCol w:w="1423"/>
       </w:tblGrid>
       <w:tr>
         <w:trPr>
@@ -530,7 +531,7 @@
               <w:pStyle w:val="Compact"/>
             </w:pPr>
             <w:r>
-              <w:t xml:space="preserve">Gnome Terminal</w:t>
+              <w:t xml:space="preserve">GNOME Terminal</w:t>
             </w:r>
           </w:p>
         </w:tc>
@@ -543,7 +544,7 @@
               <w:pStyle w:val="Compact"/>
             </w:pPr>
             <w:r>
-              <w:t xml:space="preserve">GPU Rendering</w:t>
+              <w:t xml:space="preserve">Renderizado por GPU</w:t>
             </w:r>
           </w:p>
         </w:tc>
@@ -554,7 +555,7 @@
               <w:pStyle w:val="Compact"/>
             </w:pPr>
             <w:r>
-              <w:t xml:space="preserve">✅</w:t>
+              <w:t xml:space="preserve">Sí</w:t>
             </w:r>
           </w:p>
         </w:tc>
@@ -565,7 +566,7 @@
               <w:pStyle w:val="Compact"/>
             </w:pPr>
             <w:r>
-              <w:t xml:space="preserve">✅</w:t>
+              <w:t xml:space="preserve">Sí</w:t>
             </w:r>
           </w:p>
         </w:tc>
@@ -576,7 +577,7 @@
               <w:pStyle w:val="Compact"/>
             </w:pPr>
             <w:r>
-              <w:t xml:space="preserve">✅</w:t>
+              <w:t xml:space="preserve">Sí</w:t>
             </w:r>
           </w:p>
         </w:tc>
@@ -587,7 +588,7 @@
               <w:pStyle w:val="Compact"/>
             </w:pPr>
             <w:r>
-              <w:t xml:space="preserve">❌</w:t>
+              <w:t xml:space="preserve">No</w:t>
             </w:r>
           </w:p>
         </w:tc>
@@ -600,7 +601,7 @@
               <w:pStyle w:val="Compact"/>
             </w:pPr>
             <w:r>
-              <w:t xml:space="preserve">Tabs nativos</w:t>
+              <w:t xml:space="preserve">Pestañas nativas</w:t>
             </w:r>
           </w:p>
         </w:tc>
@@ -611,7 +612,7 @@
               <w:pStyle w:val="Compact"/>
             </w:pPr>
             <w:r>
-              <w:t xml:space="preserve">✅</w:t>
+              <w:t xml:space="preserve">Sí</w:t>
             </w:r>
           </w:p>
         </w:tc>
@@ -622,7 +623,7 @@
               <w:pStyle w:val="Compact"/>
             </w:pPr>
             <w:r>
-              <w:t xml:space="preserve">❌</w:t>
+              <w:t xml:space="preserve">No</w:t>
             </w:r>
           </w:p>
         </w:tc>
@@ -633,7 +634,7 @@
               <w:pStyle w:val="Compact"/>
             </w:pPr>
             <w:r>
-              <w:t xml:space="preserve">✅</w:t>
+              <w:t xml:space="preserve">Sí</w:t>
             </w:r>
           </w:p>
         </w:tc>
@@ -644,7 +645,7 @@
               <w:pStyle w:val="Compact"/>
             </w:pPr>
             <w:r>
-              <w:t xml:space="preserve">✅</w:t>
+              <w:t xml:space="preserve">Sí</w:t>
             </w:r>
           </w:p>
         </w:tc>
@@ -657,7 +658,7 @@
               <w:pStyle w:val="Compact"/>
             </w:pPr>
             <w:r>
-              <w:t xml:space="preserve">Splits nativos</w:t>
+              <w:t xml:space="preserve">División de paneles</w:t>
             </w:r>
           </w:p>
         </w:tc>
@@ -668,7 +669,7 @@
               <w:pStyle w:val="Compact"/>
             </w:pPr>
             <w:r>
-              <w:t xml:space="preserve">✅</w:t>
+              <w:t xml:space="preserve">Sí</w:t>
             </w:r>
           </w:p>
         </w:tc>
@@ -679,7 +680,7 @@
               <w:pStyle w:val="Compact"/>
             </w:pPr>
             <w:r>
-              <w:t xml:space="preserve">❌</w:t>
+              <w:t xml:space="preserve">No</w:t>
             </w:r>
           </w:p>
         </w:tc>
@@ -690,7 +691,7 @@
               <w:pStyle w:val="Compact"/>
             </w:pPr>
             <w:r>
-              <w:t xml:space="preserve">✅</w:t>
+              <w:t xml:space="preserve">Sí</w:t>
             </w:r>
           </w:p>
         </w:tc>
@@ -701,7 +702,7 @@
               <w:pStyle w:val="Compact"/>
             </w:pPr>
             <w:r>
-              <w:t xml:space="preserve">❌</w:t>
+              <w:t xml:space="preserve">No</w:t>
             </w:r>
           </w:p>
         </w:tc>
@@ -714,7 +715,7 @@
               <w:pStyle w:val="Compact"/>
             </w:pPr>
             <w:r>
-              <w:t xml:space="preserve">Imágenes</w:t>
+              <w:t xml:space="preserve">Soporte para imágenes</w:t>
             </w:r>
           </w:p>
         </w:tc>
@@ -725,7 +726,7 @@
               <w:pStyle w:val="Compact"/>
             </w:pPr>
             <w:r>
-              <w:t xml:space="preserve">✅</w:t>
+              <w:t xml:space="preserve">Sí</w:t>
             </w:r>
           </w:p>
         </w:tc>
@@ -736,7 +737,7 @@
               <w:pStyle w:val="Compact"/>
             </w:pPr>
             <w:r>
-              <w:t xml:space="preserve">❌</w:t>
+              <w:t xml:space="preserve">No</w:t>
             </w:r>
           </w:p>
         </w:tc>
@@ -747,7 +748,7 @@
               <w:pStyle w:val="Compact"/>
             </w:pPr>
             <w:r>
-              <w:t xml:space="preserve">✅</w:t>
+              <w:t xml:space="preserve">Sí</w:t>
             </w:r>
           </w:p>
         </w:tc>
@@ -758,7 +759,7 @@
               <w:pStyle w:val="Compact"/>
             </w:pPr>
             <w:r>
-              <w:t xml:space="preserve">❌</w:t>
+              <w:t xml:space="preserve">No</w:t>
             </w:r>
           </w:p>
         </w:tc>
@@ -771,7 +772,7 @@
               <w:pStyle w:val="Compact"/>
             </w:pPr>
             <w:r>
-              <w:t xml:space="preserve">Ligaduras</w:t>
+              <w:t xml:space="preserve">Ligaduras (ligatures)</w:t>
             </w:r>
           </w:p>
         </w:tc>
@@ -782,7 +783,7 @@
               <w:pStyle w:val="Compact"/>
             </w:pPr>
             <w:r>
-              <w:t xml:space="preserve">✅</w:t>
+              <w:t xml:space="preserve">Sí</w:t>
             </w:r>
           </w:p>
         </w:tc>
@@ -793,7 +794,7 @@
               <w:pStyle w:val="Compact"/>
             </w:pPr>
             <w:r>
-              <w:t xml:space="preserve">✅</w:t>
+              <w:t xml:space="preserve">Sí</w:t>
             </w:r>
           </w:p>
         </w:tc>
@@ -804,7 +805,7 @@
               <w:pStyle w:val="Compact"/>
             </w:pPr>
             <w:r>
-              <w:t xml:space="preserve">✅</w:t>
+              <w:t xml:space="preserve">Sí</w:t>
             </w:r>
           </w:p>
         </w:tc>
@@ -815,7 +816,7 @@
               <w:pStyle w:val="Compact"/>
             </w:pPr>
             <w:r>
-              <w:t xml:space="preserve">✅</w:t>
+              <w:t xml:space="preserve">Sí</w:t>
             </w:r>
           </w:p>
         </w:tc>
@@ -828,7 +829,7 @@
               <w:pStyle w:val="Compact"/>
             </w:pPr>
             <w:r>
-              <w:t xml:space="preserve">Extensiones</w:t>
+              <w:t xml:space="preserve">Sistema de extensiones</w:t>
             </w:r>
           </w:p>
         </w:tc>
@@ -839,7 +840,7 @@
               <w:pStyle w:val="Compact"/>
             </w:pPr>
             <w:r>
-              <w:t xml:space="preserve">✅ (kittens)</w:t>
+              <w:t xml:space="preserve">Sí (kittens)</w:t>
             </w:r>
           </w:p>
         </w:tc>
@@ -850,7 +851,7 @@
               <w:pStyle w:val="Compact"/>
             </w:pPr>
             <w:r>
-              <w:t xml:space="preserve">❌</w:t>
+              <w:t xml:space="preserve">No</w:t>
             </w:r>
           </w:p>
         </w:tc>
@@ -861,7 +862,7 @@
               <w:pStyle w:val="Compact"/>
             </w:pPr>
             <w:r>
-              <w:t xml:space="preserve">✅</w:t>
+              <w:t xml:space="preserve">Sí</w:t>
             </w:r>
           </w:p>
         </w:tc>
@@ -872,7 +873,7 @@
               <w:pStyle w:val="Compact"/>
             </w:pPr>
             <w:r>
-              <w:t xml:space="preserve">❌</w:t>
+              <w:t xml:space="preserve">No</w:t>
             </w:r>
           </w:p>
         </w:tc>
@@ -885,7 +886,7 @@
               <w:pStyle w:val="Compact"/>
             </w:pPr>
             <w:r>
-              <w:t xml:space="preserve">Control remoto</w:t>
+              <w:t xml:space="preserve">Control remoto (SSH)</w:t>
             </w:r>
           </w:p>
         </w:tc>
@@ -896,7 +897,7 @@
               <w:pStyle w:val="Compact"/>
             </w:pPr>
             <w:r>
-              <w:t xml:space="preserve">✅</w:t>
+              <w:t xml:space="preserve">Sí</w:t>
             </w:r>
           </w:p>
         </w:tc>
@@ -907,7 +908,7 @@
               <w:pStyle w:val="Compact"/>
             </w:pPr>
             <w:r>
-              <w:t xml:space="preserve">❌</w:t>
+              <w:t xml:space="preserve">No</w:t>
             </w:r>
           </w:p>
         </w:tc>
@@ -918,7 +919,7 @@
               <w:pStyle w:val="Compact"/>
             </w:pPr>
             <w:r>
-              <w:t xml:space="preserve">✅</w:t>
+              <w:t xml:space="preserve">Sí</w:t>
             </w:r>
           </w:p>
         </w:tc>
@@ -929,7 +930,7 @@
               <w:pStyle w:val="Compact"/>
             </w:pPr>
             <w:r>
-              <w:t xml:space="preserve">❌</w:t>
+              <w:t xml:space="preserve">No</w:t>
             </w:r>
           </w:p>
         </w:tc>
@@ -953,7 +954,7 @@
               <w:pStyle w:val="Compact"/>
             </w:pPr>
             <w:r>
-              <w:t xml:space="preserve">✅</w:t>
+              <w:t xml:space="preserve">Sí (Linux/macOS/Windows)</w:t>
             </w:r>
           </w:p>
         </w:tc>
@@ -964,7 +965,7 @@
               <w:pStyle w:val="Compact"/>
             </w:pPr>
             <w:r>
-              <w:t xml:space="preserve">✅</w:t>
+              <w:t xml:space="preserve">Sí (Linux/macOS/Windows)</w:t>
             </w:r>
           </w:p>
         </w:tc>
@@ -975,7 +976,7 @@
               <w:pStyle w:val="Compact"/>
             </w:pPr>
             <w:r>
-              <w:t xml:space="preserve">❌ (solo macOS)</w:t>
+              <w:t xml:space="preserve">No (solo macOS)</w:t>
             </w:r>
           </w:p>
         </w:tc>
@@ -986,7 +987,7 @@
               <w:pStyle w:val="Compact"/>
             </w:pPr>
             <w:r>
-              <w:t xml:space="preserve">❌ (solo Linux)</w:t>
+              <w:t xml:space="preserve">No (solo Linux)</w:t>
             </w:r>
           </w:p>
         </w:tc>

</xml_diff>